<commit_message>
Fix reconstruction line breaks, bold formatting, and table text safeguards
</commit_message>
<xml_diff>
--- a/backend/outputs/sample-files.com-formatted-report_reconstructed_hi.docx
+++ b/backend/outputs/sample-files.com-formatted-report_reconstructed_hi.docx
@@ -14,15 +14,12 @@
           <w:szCs w:val="46"/>
         </w:rPr>
       </w:pPr>
-      <w:bookmarkStart w:id="0" w:name="_3hoprl9ejdzu" w:colFirst="0" w:colLast="0"/>
-      <w:bookmarkEnd w:id="0"/>
       <w:r>
         <w:rPr>
           <w:b/>
           <w:sz w:val="46"/>
-          <w:szCs w:val="46"/>
-        </w:rPr>
-        <w:t>तिमाही व्यवसाय प्रदर्शन विश्लेषण।</w:t>
+        </w:rPr>
+        <w:t>तिमाही व्यवसाय प्रदर्शन विश्लेषण</w:t>
       </w:r>
     </w:p>
     <w:p>
@@ -37,15 +34,12 @@
           <w:szCs w:val="34"/>
         </w:rPr>
       </w:pPr>
-      <w:bookmarkStart w:id="1" w:name="_u1i85q5lfsgs" w:colFirst="0" w:colLast="0"/>
-      <w:bookmarkEnd w:id="1"/>
       <w:r>
         <w:rPr>
           <w:b/>
           <w:sz w:val="34"/>
-          <w:szCs w:val="34"/>
-        </w:rPr>
-        <w:t>Q3 2024 कार्यकारी सारांश।</w:t>
+        </w:rPr>
+        <w:t>Q3 2024 कार्यकारी सारांश</w:t>
       </w:r>
     </w:p>
     <w:p>
@@ -59,12 +53,19 @@
         <w:rPr>
           <w:i/>
         </w:rPr>
-        <w:t>द्वारा तैयारः बिजनेस एनालिटिक्स टीम की तारीखः 15 अक्टूबर, 2024</w:t>
+        <w:t>द्वारा तैयारः बिजनेस एनालिटिक्स टीम</w:t>
       </w:r>
       <w:r>
         <w:rPr>
           <w:i/>
         </w:rPr>
+        <w:br/>
+      </w:r>
+      <w:r>
+        <w:rPr>
+          <w:i/>
+        </w:rPr>
+        <w:t>दिनांकः 15 अक्टूबर, 2024</w:t>
       </w:r>
     </w:p>
     <w:p>
@@ -81,13 +82,10 @@
         <w:keepLines w:val="0"/>
         <w:spacing w:after="80"/>
       </w:pPr>
-      <w:bookmarkStart w:id="2" w:name="_r0txfijzop3z" w:colFirst="0" w:colLast="0"/>
-      <w:bookmarkEnd w:id="2"/>
       <w:r>
         <w:rPr>
           <w:b/>
           <w:sz w:val="34"/>
-          <w:szCs w:val="34"/>
         </w:rPr>
         <w:t>सामग्री की सारणी.</w:t>
       </w:r>
@@ -399,15 +397,12 @@
           <w:szCs w:val="34"/>
         </w:rPr>
       </w:pPr>
-      <w:bookmarkStart w:id="3" w:name="_c5moucofs8ob" w:colFirst="0" w:colLast="0"/>
-      <w:bookmarkEnd w:id="3"/>
       <w:r>
         <w:rPr>
           <w:b/>
           <w:sz w:val="34"/>
-          <w:szCs w:val="34"/>
-        </w:rPr>
-        <w:t>कार्यकारी सारांश।</w:t>
+        </w:rPr>
+        <w:t>कार्यकारी सारांश</w:t>
       </w:r>
     </w:p>
     <w:p>
@@ -415,7 +410,7 @@
         <w:spacing w:before="240" w:after="240"/>
       </w:pPr>
       <w:r>
-        <w:t>2024 की तीसरी तिमाही ने बाजार हिस्सेदारी और परिचालन दक्षता में उल्लेखनीय सुधार के साथ प्रमुख प्रदर्शन संकेतकों में मजबूत वृद्धि का प्रदर्शन किया। यह रिपोर्ट हमारे प्रदर्शन और रणनीतिक स्थिति का विस्तृत विश्लेषण प्रदान करती है।</w:t>
+        <w:t>2024 की तीसरी तिमाही ने बाजार हिस्सेदारी और परिचालन दक्षता में उल्लेखनीय सुधार के साथ प्रमुख प्रदर्शन संकेतकों में मजबूत वृद्धि का प्रदर्शन किया। यह रिपोर्ट हमारे प्रदर्शन और रणनीतिक स्थिति का विस्तृत विश्लेषण प्रदान करती है.</w:t>
       </w:r>
     </w:p>
     <w:p>
@@ -431,14 +426,11 @@
           <w:szCs w:val="26"/>
         </w:rPr>
       </w:pPr>
-      <w:bookmarkStart w:id="4" w:name="_fvlntl24dlsj" w:colFirst="0" w:colLast="0"/>
-      <w:bookmarkEnd w:id="4"/>
       <w:r>
         <w:rPr>
           <w:b/>
           <w:color w:val="000000"/>
           <w:sz w:val="26"/>
-          <w:szCs w:val="26"/>
         </w:rPr>
         <w:t>प्रमुख विशेषताएँ.</w:t>
       </w:r>
@@ -498,15 +490,12 @@
           <w:szCs w:val="34"/>
         </w:rPr>
       </w:pPr>
-      <w:bookmarkStart w:id="5" w:name="_w7u9drmnjrgv" w:colFirst="0" w:colLast="0"/>
-      <w:bookmarkEnd w:id="5"/>
       <w:r>
         <w:rPr>
           <w:b/>
           <w:sz w:val="34"/>
-          <w:szCs w:val="34"/>
-        </w:rPr>
-        <w:t>वित्तीय प्रदर्शन।</w:t>
+        </w:rPr>
+        <w:t>वित्तीय प्रदर्शन</w:t>
       </w:r>
     </w:p>
     <w:p>
@@ -522,16 +511,13 @@
           <w:szCs w:val="26"/>
         </w:rPr>
       </w:pPr>
-      <w:bookmarkStart w:id="6" w:name="_vbio6eked8k0" w:colFirst="0" w:colLast="0"/>
-      <w:bookmarkEnd w:id="6"/>
       <w:r>
         <w:rPr>
           <w:b/>
           <w:color w:val="000000"/>
           <w:sz w:val="26"/>
-          <w:szCs w:val="26"/>
-        </w:rPr>
-        <w:t>राजस्व विश्लेषण।</w:t>
+        </w:rPr>
+        <w:t>राजस्व विश्लेषण</w:t>
       </w:r>
     </w:p>
     <w:p>
@@ -539,7 +525,7 @@
         <w:spacing w:before="240" w:after="240"/>
       </w:pPr>
       <w:r>
-        <w:t>हमारा Q3 2024 राजस्व $ 125.3M तक पहुंच गया, जो पिछले वर्ष के $ 108.8M के आंकड़े से एक महत्वपूर्ण वृद्धि का प्रतिनिधित्व करता है। यह वृद्धि मुख्य रूप से प्रेरित थीः . .</w:t>
+        <w:t>हमारा Q3 2024 राजस्व $ 125.3M तक पहुंच गया, जो पिछले वर्ष के $ 108.8M के आंकड़े से एक महत्वपूर्ण वृद्धि का प्रतिनिधित्व करता है। यह वृद्धि मुख्य रूप से प्रेरित थी:</w:t>
       </w:r>
     </w:p>
     <w:p>
@@ -562,7 +548,7 @@
         </w:numPr>
       </w:pPr>
       <w:r>
-        <w:t>विस्तारित वितरण चैनल ।</w:t>
+        <w:t>विस्तारित वितरण चैनल</w:t>
       </w:r>
     </w:p>
     <w:p>
@@ -574,7 +560,7 @@
         <w:spacing w:after="240"/>
       </w:pPr>
       <w:r>
-        <w:t>डिजिटल उपस्थिति में वृद्धि।</w:t>
+        <w:t>डिजिटल उपस्थिति में वृद्धि</w:t>
       </w:r>
     </w:p>
     <w:p>
@@ -589,15 +575,12 @@
           <w:szCs w:val="34"/>
         </w:rPr>
       </w:pPr>
-      <w:bookmarkStart w:id="7" w:name="_olw7k7xfbn2" w:colFirst="0" w:colLast="0"/>
-      <w:bookmarkEnd w:id="7"/>
       <w:r>
         <w:rPr>
           <w:b/>
           <w:sz w:val="34"/>
-          <w:szCs w:val="34"/>
-        </w:rPr>
-        <w:t>मार्जिन विश्लेषण ।</w:t>
+        </w:rPr>
+        <w:t>मार्जिन विश्लेषण</w:t>
       </w:r>
     </w:p>
     <w:p/>
@@ -653,7 +636,7 @@
               <w:rPr>
                 <w:b/>
               </w:rPr>
-              <w:t>श्रेणी।</w:t>
+              <w:t>श्रेणी</w:t>
             </w:r>
           </w:p>
         </w:tc>
@@ -687,7 +670,7 @@
               <w:rPr>
                 <w:b/>
               </w:rPr>
-              <w:t>Q3 2023 ।</w:t>
+              <w:t>Q3 2023</w:t>
             </w:r>
           </w:p>
         </w:tc>
@@ -755,7 +738,7 @@
               <w:rPr>
                 <w:b/>
               </w:rPr>
-              <w:t>बदलाव करें।</w:t>
+              <w:t>बदलाव करें</w:t>
             </w:r>
           </w:p>
         </w:tc>
@@ -785,7 +768,7 @@
               <w:spacing w:line="240" w:lineRule="auto"/>
             </w:pPr>
             <w:r>
-              <w:t>सकल मार्जिन ।</w:t>
+              <w:t>सकल मार्जिन</w:t>
             </w:r>
           </w:p>
         </w:tc>
@@ -841,7 +824,7 @@
               <w:spacing w:line="240" w:lineRule="auto"/>
             </w:pPr>
             <w:r>
-              <w:t>64.1 प्रतिशत ।</w:t>
+              <w:t>64.1%</w:t>
             </w:r>
           </w:p>
         </w:tc>
@@ -899,7 +882,7 @@
               <w:spacing w:line="240" w:lineRule="auto"/>
             </w:pPr>
             <w:r>
-              <w:t>ऑपरेटिंग मार्जिन ।</w:t>
+              <w:t>ऑपरेटिंग मार्जिन</w:t>
             </w:r>
           </w:p>
         </w:tc>
@@ -927,7 +910,7 @@
               <w:spacing w:line="240" w:lineRule="auto"/>
             </w:pPr>
             <w:r>
-              <w:t>28.3 प्रतिशत ।</w:t>
+              <w:t>28.3%</w:t>
             </w:r>
           </w:p>
         </w:tc>
@@ -1013,7 +996,7 @@
               <w:spacing w:line="240" w:lineRule="auto"/>
             </w:pPr>
             <w:r>
-              <w:t>नेट मार्जिन ।</w:t>
+              <w:t>नेट मार्जिन</w:t>
             </w:r>
           </w:p>
         </w:tc>
@@ -1069,7 +1052,7 @@
               <w:spacing w:line="240" w:lineRule="auto"/>
             </w:pPr>
             <w:r>
-              <w:t>23.1 प्रतिशत ।</w:t>
+              <w:t>23.1%</w:t>
             </w:r>
           </w:p>
         </w:tc>
@@ -1097,7 +1080,7 @@
               <w:spacing w:line="240" w:lineRule="auto"/>
             </w:pPr>
             <w:r>
-              <w:t>+1.7 प्रतिशत।</w:t>
+              <w:t>+1.7%</w:t>
             </w:r>
           </w:p>
         </w:tc>
@@ -1123,15 +1106,12 @@
           <w:szCs w:val="34"/>
         </w:rPr>
       </w:pPr>
-      <w:bookmarkStart w:id="8" w:name="_ppa0ncpv2dz" w:colFirst="0" w:colLast="0"/>
-      <w:bookmarkEnd w:id="8"/>
       <w:r>
         <w:rPr>
           <w:b/>
           <w:sz w:val="34"/>
-          <w:szCs w:val="34"/>
-        </w:rPr>
-        <w:t>बाजार विश्लेषण ।</w:t>
+        </w:rPr>
+        <w:t>बाजार विश्लेषण</w:t>
       </w:r>
     </w:p>
     <w:p>
@@ -1139,7 +1119,7 @@
         <w:spacing w:before="240" w:after="240"/>
       </w:pPr>
       <w:r>
-        <w:t>कंपनी ने नए क्षेत्रों में विस्तार करते हुए अपनी मजबूत बाजार स्थिति बनाए रखी है। प्रमुख घटनाएँः</w:t>
+        <w:t>कंपनी ने नए क्षेत्रों में विस्तार करते हुए अपनी मजबूत बाजार स्थिति बनाए रखी है। प्रमुख विकास में शामिल हैं:</w:t>
       </w:r>
     </w:p>
     <w:p>
@@ -1155,16 +1135,13 @@
           <w:szCs w:val="26"/>
         </w:rPr>
       </w:pPr>
-      <w:bookmarkStart w:id="9" w:name="_ss5ydbx1e2d4" w:colFirst="0" w:colLast="0"/>
-      <w:bookmarkEnd w:id="9"/>
       <w:r>
         <w:rPr>
           <w:b/>
           <w:color w:val="000000"/>
           <w:sz w:val="26"/>
-          <w:szCs w:val="26"/>
-        </w:rPr>
-        <w:t>ग्राफिक विस्तार ।</w:t>
+        </w:rPr>
+        <w:t>ग्राफिक विस्तार</w:t>
       </w:r>
     </w:p>
     <w:p>
@@ -1179,9 +1156,11 @@
         <w:rPr>
           <w:b/>
         </w:rPr>
-        <w:t>उत्तरी अमेरिकाः 45% बाजार हिस्सेदारी (+3%) ।</w:t>
-      </w:r>
-      <w:r/>
+        <w:t>उत्तरी अमेरिका</w:t>
+      </w:r>
+      <w:r>
+        <w:t>: बाजार हिस्सेदारी 45% (+3)%)</w:t>
+      </w:r>
     </w:p>
     <w:p>
       <w:pPr>
@@ -1194,9 +1173,11 @@
         <w:rPr>
           <w:b/>
         </w:rPr>
-        <w:t>यूरोपः 28% बाजार हिस्सेदारी (+2%) ।</w:t>
-      </w:r>
-      <w:r/>
+        <w:t>यूरोप</w:t>
+      </w:r>
+      <w:r>
+        <w:t>: 28% बाजार हिस्सेदारी (+2)%)</w:t>
+      </w:r>
     </w:p>
     <w:p>
       <w:pPr>
@@ -1210,9 +1191,11 @@
         <w:rPr>
           <w:b/>
         </w:rPr>
-        <w:t>एशिया-प्रशांतः 18% बाजार हिस्सेदारी (+5%) ।</w:t>
-      </w:r>
-      <w:r/>
+        <w:t>एशिया-प्रशांत</w:t>
+      </w:r>
+      <w:r>
+        <w:t>: बाजार हिस्सेदारी 18% (+5%)</w:t>
+      </w:r>
     </w:p>
     <w:p>
       <w:pPr>
@@ -1227,16 +1210,13 @@
           <w:szCs w:val="26"/>
         </w:rPr>
       </w:pPr>
-      <w:bookmarkStart w:id="10" w:name="_tyuz9ngjd5aa" w:colFirst="0" w:colLast="0"/>
-      <w:bookmarkEnd w:id="10"/>
       <w:r>
         <w:rPr>
           <w:b/>
           <w:color w:val="000000"/>
           <w:sz w:val="26"/>
-          <w:szCs w:val="26"/>
-        </w:rPr>
-        <w:t>प्रतिस्पर्धी परिदृश्य ।</w:t>
+        </w:rPr>
+        <w:t>प्रतिस्पर्धी परिदृश्य</w:t>
       </w:r>
     </w:p>
     <w:p>
@@ -1244,7 +1224,7 @@
         <w:spacing w:before="240" w:after="240"/>
       </w:pPr>
       <w:r>
-        <w:t>हमारी प्रतिस्पर्धी स्थिति मजबूत हुई है</w:t>
+        <w:t>हमारी प्रतिस्पर्धी स्थिति मजबूत हुई है:</w:t>
       </w:r>
     </w:p>
     <w:p>
@@ -1256,7 +1236,7 @@
         <w:spacing w:before="240"/>
       </w:pPr>
       <w:r>
-        <w:t>रणनीतिक साझेदारी।</w:t>
+        <w:t>रणनीतिक साझेदारी</w:t>
       </w:r>
     </w:p>
     <w:p>
@@ -1267,7 +1247,7 @@
         </w:numPr>
       </w:pPr>
       <w:r>
-        <w:t>उत्पाद नवाचार।</w:t>
+        <w:t>उत्पाद नवाचार</w:t>
       </w:r>
     </w:p>
     <w:p>
@@ -1279,7 +1259,7 @@
         <w:spacing w:after="240"/>
       </w:pPr>
       <w:r>
-        <w:t>ग्राहक सेवा में वृद्धि।</w:t>
+        <w:t>ग्राहक सेवा में वृद्धि</w:t>
       </w:r>
     </w:p>
     <w:p>
@@ -1302,15 +1282,12 @@
           <w:szCs w:val="34"/>
         </w:rPr>
       </w:pPr>
-      <w:bookmarkStart w:id="11" w:name="_lnlxrqo4aqlq" w:colFirst="0" w:colLast="0"/>
-      <w:bookmarkEnd w:id="11"/>
       <w:r>
         <w:rPr>
           <w:b/>
           <w:sz w:val="34"/>
-          <w:szCs w:val="34"/>
-        </w:rPr>
-        <w:t>ऑपरेशनल मेट्रिक्स ।</w:t>
+        </w:rPr>
+        <w:t>ऑपरेशनल मेट्रिक्स</w:t>
       </w:r>
     </w:p>
     <w:p>
@@ -1326,16 +1303,13 @@
           <w:szCs w:val="26"/>
         </w:rPr>
       </w:pPr>
-      <w:bookmarkStart w:id="12" w:name="_sk28j4tyc25k" w:colFirst="0" w:colLast="0"/>
-      <w:bookmarkEnd w:id="12"/>
       <w:r>
         <w:rPr>
           <w:b/>
           <w:color w:val="000000"/>
           <w:sz w:val="26"/>
-          <w:szCs w:val="26"/>
-        </w:rPr>
-        <w:t>दक्षता इंडिकेटर।</w:t>
+        </w:rPr>
+        <w:t>दक्षता इंडिकेटर</w:t>
       </w:r>
     </w:p>
     <w:p>
@@ -1358,7 +1332,7 @@
         </w:numPr>
       </w:pPr>
       <w:r>
-        <w:t>आपूर्ति श्रृंखला अनुकूलनः 12% लागत में कमी।</w:t>
+        <w:t>आपूर्ति श्रृंखला अनुकूलनः 12% लागत में कमी</w:t>
       </w:r>
     </w:p>
     <w:p>
@@ -1386,16 +1360,13 @@
           <w:szCs w:val="26"/>
         </w:rPr>
       </w:pPr>
-      <w:bookmarkStart w:id="13" w:name="_iqai1ybkvmki" w:colFirst="0" w:colLast="0"/>
-      <w:bookmarkEnd w:id="13"/>
       <w:r>
         <w:rPr>
           <w:b/>
           <w:color w:val="000000"/>
           <w:sz w:val="26"/>
-          <w:szCs w:val="26"/>
-        </w:rPr>
-        <w:t>गुणवत्ता मेट्रिक्स।</w:t>
+        </w:rPr>
+        <w:t>गुणवत्ता मेट्रिक्स</w:t>
       </w:r>
     </w:p>
     <w:p>
@@ -1407,7 +1378,7 @@
         <w:spacing w:before="240"/>
       </w:pPr>
       <w:r>
-        <w:t>दोष दरः 0.3% (-0.2%) ।</w:t>
+        <w:t>दोषः 0.3% (-0.2%)</w:t>
       </w:r>
     </w:p>
     <w:p>
@@ -1418,7 +1389,7 @@
         </w:numPr>
       </w:pPr>
       <w:r>
-        <w:t>ग्राहक रिटर्नः 1.2% (-0.4%) ।</w:t>
+        <w:t>ग्राहक रिटर्नः 1.2% (-0.4%)</w:t>
       </w:r>
     </w:p>
     <w:p>
@@ -1452,15 +1423,12 @@
           <w:szCs w:val="34"/>
         </w:rPr>
       </w:pPr>
-      <w:bookmarkStart w:id="14" w:name="_dd8k57jyduk2" w:colFirst="0" w:colLast="0"/>
-      <w:bookmarkEnd w:id="14"/>
       <w:r>
         <w:rPr>
           <w:b/>
           <w:sz w:val="34"/>
-          <w:szCs w:val="34"/>
-        </w:rPr>
-        <w:t>भविष्य का दृष्टिकोण।</w:t>
+        </w:rPr>
+        <w:t>भविष्य का दृष्टिकोण</w:t>
       </w:r>
     </w:p>
     <w:p>
@@ -1476,16 +1444,13 @@
           <w:szCs w:val="26"/>
         </w:rPr>
       </w:pPr>
-      <w:bookmarkStart w:id="15" w:name="_eqs9ft5hhrpp" w:colFirst="0" w:colLast="0"/>
-      <w:bookmarkEnd w:id="15"/>
       <w:r>
         <w:rPr>
           <w:b/>
           <w:color w:val="000000"/>
           <w:sz w:val="26"/>
-          <w:szCs w:val="26"/>
-        </w:rPr>
-        <w:t>Q4 2024 के लिए रणनीतिक पहल।</w:t>
+        </w:rPr>
+        <w:t>Q4 2024 के लिए रणनीतिक पहल</w:t>
       </w:r>
     </w:p>
     <w:p>
@@ -1511,7 +1476,7 @@
         </w:numPr>
       </w:pPr>
       <w:r>
-        <w:t>ग्राहक सेवा में एआई कार्यान्वयन।</w:t>
+        <w:t>ग्राहक सेवा में एआई कार्यान्वयन</w:t>
       </w:r>
     </w:p>
     <w:p>
@@ -1522,7 +1487,7 @@
         </w:numPr>
       </w:pPr>
       <w:r>
-        <w:t>डेटा विश्लेषण क्षमताओं में वृद्धि।</w:t>
+        <w:t>डेटा विश्लेषण क्षमताओं में वृद्धि</w:t>
       </w:r>
     </w:p>
     <w:p>
@@ -1533,7 +1498,7 @@
         </w:numPr>
       </w:pPr>
       <w:r>
-        <w:t>स्वचालित रिपोर्टिंग सिस्टम।</w:t>
+        <w:t>स्वचालित रिपोर्टिंग सिस्टम</w:t>
       </w:r>
     </w:p>
     <w:p>
@@ -1558,7 +1523,7 @@
         </w:numPr>
       </w:pPr>
       <w:r>
-        <w:t>उभरते बाजारों में प्रवेश।</w:t>
+        <w:t>उभरते बाजारों में प्रवेश</w:t>
       </w:r>
     </w:p>
     <w:p>
@@ -1569,7 +1534,7 @@
         </w:numPr>
       </w:pPr>
       <w:r>
-        <w:t>उत्पाद स्थानीयकरण।</w:t>
+        <w:t>उत्पाद स्थानीयकरण</w:t>
       </w:r>
     </w:p>
     <w:p>
@@ -1580,7 +1545,7 @@
         </w:numPr>
       </w:pPr>
       <w:r>
-        <w:t>चैनल साझेदार विकास।</w:t>
+        <w:t>चैनल साझेदार विकास</w:t>
       </w:r>
     </w:p>
     <w:p>
@@ -1594,7 +1559,7 @@
         <w:rPr>
           <w:b/>
         </w:rPr>
-        <w:t>परिचालन उत्कृष्टता।</w:t>
+        <w:t>परिचालन उत्कृष्टता</w:t>
       </w:r>
     </w:p>
     <w:p>
@@ -1616,7 +1581,7 @@
         </w:numPr>
       </w:pPr>
       <w:r>
-        <w:t>गुणवत्ता प्रबंधन प्रणाली उन्नयन।</w:t>
+        <w:t>गुणवत्ता प्रबंधन प्रणाली उन्नयन</w:t>
       </w:r>
     </w:p>
     <w:p>
@@ -1628,7 +1593,7 @@
         <w:spacing w:after="240"/>
       </w:pPr>
       <w:r>
-        <w:t>कार्यबल का विकास।</w:t>
+        <w:t>कार्यबल का विकास</w:t>
       </w:r>
     </w:p>
     <w:p>
@@ -1646,22 +1611,13 @@
         <w:rPr>
           <w:i/>
         </w:rPr>
-        <w:t>यह नमूना DOCX फ़ाइल Sample-Files.com द्वारा प्रदान की जाती है। अधिक नमूना फ़ाइलों और संसाधनों के लिए हमसे संपर्क करें।</w:t>
-      </w:r>
-      <w:hyperlink r:id="rId7">
-        <w:r>
-          <w:rPr>
-            <w:i/>
-            <w:color w:val="1155CC"/>
-            <w:u w:val="single"/>
-          </w:rPr>
-          <w:t>Sample-Files.com</w:t>
-        </w:r>
-      </w:hyperlink>
+        <w:t xml:space="preserve">यह नमूना DOCX फ़ाइल द्वारा प्रदान किया जाता है </w:t>
+      </w:r>
       <w:r>
         <w:rPr>
           <w:i/>
         </w:rPr>
+        <w:t>. अधिक नमूना फ़ाइलों और संसाधनों के लिए हमसे संपर्क करें.</w:t>
       </w:r>
     </w:p>
     <w:sectPr>

</xml_diff>